<commit_message>
fix(rbpp): corrige la veille HAS du 14/09 et durcit le prompt (étape 7 : édition précédente, page ⛔ ≠ fait de mémoire, sources listées, contrôle des attributions ; garde-fous 4 et 6)
- veille : titre du webinaire exact, habitat volet 3 clos le 03/04/2026, calendrier de la note de cadrage
  (liée) pour la RBPP 3-11 ans, consultation esthétique liée et comptée (3 ✅ — 6), adresse canonique SSP ;
  journal des corrections ; B-FR exit 1 → 0, décompte COHÉRENT
- témoin d'avant correction ajouté (exit 1)

Co-Authored-By: Claude Opus 5 <noreply@anthropic.com>
</commit_message>
<xml_diff>
--- a/sources/veille/2026-09-14_veille_has-actualite.docx
+++ b/sources/veille/2026-09-14_veille_has-actualite.docx
@@ -188,7 +188,7 @@
           <w:sz w:val="22"/>
           <w:szCs w:val="22"/>
         </w:rPr>
-        <w:t xml:space="preserve">23/09/2026 — Webinaire HAS : « 6e cycle de certification : premiers résultats et perspectives vers 2030 ». Format en ligne, 12h30-14h00. (Source : calendrier HAS, consulté le 14/09/2026 — concerne les établissements de santé ; impact indirect pour les ESSMS en termes de démarche qualité comparative.)</w:t>
+        <w:t xml:space="preserve">23/09/2026 — Webinaire HAS : « 6e cycle de certification : premiers résultats et cap sur 2030 » [titre rectifié le 14/09/2026]. Format en ligne, 12h30-14h. (Source : calendrier HAS, consulté le 14/09/2026 — concerne les établissements de santé ; impact indirect pour les ESSMS en termes de démarche qualité comparative.)</w:t>
       </w:r>
     </w:p>
     <w:p>
@@ -240,26 +240,47 @@
           <w:sz w:val="22"/>
           <w:szCs w:val="22"/>
         </w:rPr>
-        <w:t xml:space="preserve">RBPP « Vie quotidienne des enfants de 3 à 11 ans accueillis dans les établissements de protection de l'enfance » — Appel à candidatures clôturé début septembre 2026 ; constitution du groupe d'experts en cours. Publication estimée : 2027 (délai habituel 18-24 mois après constitution du groupe). ⛔ Page HAS directe inaccessible lors de la consultation (authentification requise).</w:t>
-      </w:r>
-    </w:p>
-    <w:p>
-      <w:pPr>
-        <w:pStyle w:val="ListParagraph"/>
-        <w:numPr>
-          <w:ilvl w:val="0"/>
-          <w:numId w:val="1"/>
-        </w:numPr>
-        <w:spacing w:after="60"/>
-      </w:pPr>
-      <w:r>
-        <w:rPr>
-          <w:rFonts w:ascii="Calibri" w:cs="Calibri" w:eastAsia="Calibri" w:hAnsi="Calibri"/>
-          <w:color w:val="1F2937"/>
-          <w:sz w:val="22"/>
-          <w:szCs w:val="22"/>
-        </w:rPr>
-        <w:t xml:space="preserve">RBPP « Accompagner dans et vers l'habitat — Volet 3 » — Appel à candidatures en cours, statut non confirmé au 14/09/2026. ⛔ Page HAS directe inaccessible lors de la consultation (authentification requise).</w:t>
+        <w:t xml:space="preserve">RBPP « Vie quotidienne des enfants de 3 à 11 ans accueillis dans les établissements de protection de l'enfance » — Appel à candidatures clos le 4 septembre 2026 (édition du 02/09) ; la page de l'appel est désormais derrière une identification ⛔. Calendrier prévisionnel de la </w:t>
+      </w:r>
+      <w:hyperlink w:history="1" r:id="rIdcorr1409cadrage">
+        <w:r>
+          <w:rPr>
+            <w:rFonts w:ascii="Calibri" w:cs="Calibri" w:eastAsia="Calibri" w:hAnsi="Calibri"/>
+            <w:color w:val="1155CC"/>
+            <w:sz w:val="22"/>
+            <w:szCs w:val="22"/>
+            <w:u w:val="single"/>
+          </w:rPr>
+          <w:t xml:space="preserve">note de cadrage (validée le 7 juillet 2026, en ligne le 9 juillet)</w:t>
+        </w:r>
+      </w:hyperlink>
+      <w:r>
+        <w:rPr>
+          <w:rFonts w:ascii="Calibri" w:cs="Calibri" w:eastAsia="Calibri" w:hAnsi="Calibri"/>
+          <w:color w:val="1F2937"/>
+          <w:sz w:val="22"/>
+          <w:szCs w:val="22"/>
+        </w:rPr>
+        <w:t xml:space="preserve"> : composition des groupes de travail 09-10/2026, travaux 11/2026-10/2027, relecture 07-09/2027, passage en commission 4e trimestre 2027. [Corrigé le 14/09/2026 : la première version avançait « publication estimée 2027 (délai habituel 18-24 mois) », un délai de mémoire sous une page inaccessible, alors que la note de cadrage publique donne le calendrier.]</w:t>
+      </w:r>
+    </w:p>
+    <w:p>
+      <w:pPr>
+        <w:pStyle w:val="ListParagraph"/>
+        <w:numPr>
+          <w:ilvl w:val="0"/>
+          <w:numId w:val="1"/>
+        </w:numPr>
+        <w:spacing w:after="60"/>
+      </w:pPr>
+      <w:r>
+        <w:rPr>
+          <w:rFonts w:ascii="Calibri" w:cs="Calibri" w:eastAsia="Calibri" w:hAnsi="Calibri"/>
+          <w:color w:val="1F2937"/>
+          <w:sz w:val="22"/>
+          <w:szCs w:val="22"/>
+        </w:rPr>
+        <w:t xml:space="preserve">RBPP « Accompagner dans et vers l'habitat — Volet 3 » — Appel à candidatures clos le 3 avril 2026 (édition du 02/09 de cette veille, page alors ouverte) ; groupe de travail en cours. ⛔ La page de l'appel est désormais derrière une identification. [Corrigé le 14/09/2026 : la première version écrivait « appel en cours, statut non confirmé » — un appel clos depuis cinq mois, que l'édition précédente datait.]</w:t>
       </w:r>
     </w:p>
     <w:p>
@@ -302,7 +323,28 @@
           <w:sz w:val="22"/>
           <w:szCs w:val="22"/>
         </w:rPr>
-        <w:t xml:space="preserve">Consultation usagers — « Guide méthodologique de gestion des risques des actes à visée esthétique (hors actes chirurgicaux) » — publiée le 8 septembre 2026. Clôture : 30 septembre 2026. Profil recherché : personnes ayant eu recours à des actes esthétiques non chirurgicaux. Hors périmètre ESSMS mais illustre la démarche participative HAS.</w:t>
+        <w:t xml:space="preserve">Consultation ciblée d'usagers — « Guide méthodologique de gestion des risques des actes à visée esthétique (hors actes chirurgicaux) » — appel à candidature mis en ligne le 8 septembre 2026, clôture le 30 septembre 2026 ; la HAS vise un groupe de 6 à 8 usagers ayant eu recours à des actes esthétiques non chirurgicaux (</w:t>
+      </w:r>
+      <w:hyperlink w:history="1" r:id="rIdcorr1409esth">
+        <w:r>
+          <w:rPr>
+            <w:rFonts w:ascii="Calibri" w:cs="Calibri" w:eastAsia="Calibri" w:hAnsi="Calibri"/>
+            <w:color w:val="1155CC"/>
+            <w:sz w:val="22"/>
+            <w:szCs w:val="22"/>
+            <w:u w:val="single"/>
+          </w:rPr>
+          <w:t xml:space="preserve">page de l'appel</w:t>
+        </w:r>
+      </w:hyperlink>
+      <w:r>
+        <w:rPr>
+          <w:rFonts w:ascii="Calibri" w:cs="Calibri" w:eastAsia="Calibri" w:hAnsi="Calibri"/>
+          <w:color w:val="1F2937"/>
+          <w:sz w:val="22"/>
+          <w:szCs w:val="22"/>
+        </w:rPr>
+        <w:t xml:space="preserve">) [source liée le 14/09/2026 : la première version l'utilisait sans la lister]. Hors périmètre ESSMS mais illustre la démarche participative HAS.</w:t>
       </w:r>
     </w:p>
     <w:p>
@@ -442,7 +484,7 @@
           <w:sz w:val="20"/>
           <w:szCs w:val="20"/>
         </w:rPr>
-        <w:t xml:space="preserve">2 ✅ effectivement reprises dans le corps | 1 consultée sans élément nouveau | 2 ⛔ inaccessibles — 5 sources documentaires tentées</w:t>
+        <w:t xml:space="preserve">3 ✅ effectivement reprises dans le corps | 1 consultée sans élément nouveau | 2 ⛔ inaccessibles — 6 sources documentaires tentées (décompte révisé le 14/09/2026)</w:t>
       </w:r>
     </w:p>
     <w:p>
@@ -541,6 +583,46 @@
           <w:sz w:val="22"/>
           <w:szCs w:val="22"/>
         </w:rPr>
+        <w:t xml:space="preserve">✅ HAS, appel à candidature « Élaboration d'un guide méthodologique de gestion des risques des actes à visée esthétique hors actes chirurgicaux – Consultation ciblée d'usagers », mis en ligne le 8 septembre 2026 (</w:t>
+      </w:r>
+      <w:hyperlink w:history="1" r:id="rIdcorr1409esth">
+        <w:r>
+          <w:rPr>
+            <w:rFonts w:ascii="Calibri" w:cs="Calibri" w:eastAsia="Calibri" w:hAnsi="Calibri"/>
+            <w:color w:val="1155CC"/>
+            <w:sz w:val="22"/>
+            <w:szCs w:val="22"/>
+            <w:u w:val="single"/>
+          </w:rPr>
+          <w:t xml:space="preserve">has-sante.fr/jcms/p_4391619</w:t>
+        </w:r>
+      </w:hyperlink>
+      <w:r>
+        <w:rPr>
+          <w:rFonts w:ascii="Calibri" w:cs="Calibri" w:eastAsia="Calibri" w:hAnsi="Calibri"/>
+          <w:color w:val="1F2937"/>
+          <w:sz w:val="22"/>
+          <w:szCs w:val="22"/>
+        </w:rPr>
+        <w:t xml:space="preserve">) — ouvert le 14/09/2026 lors de la correction, HTTP 200</w:t>
+      </w:r>
+    </w:p>
+    <w:p>
+      <w:pPr>
+        <w:pStyle w:val="ListParagraph"/>
+        <w:numPr>
+          <w:ilvl w:val="0"/>
+          <w:numId w:val="1"/>
+        </w:numPr>
+        <w:spacing w:after="60"/>
+      </w:pPr>
+      <w:r>
+        <w:rPr>
+          <w:rFonts w:ascii="Calibri" w:cs="Calibri" w:eastAsia="Calibri" w:hAnsi="Calibri"/>
+          <w:color w:val="1F2937"/>
+          <w:sz w:val="22"/>
+          <w:szCs w:val="22"/>
+        </w:rPr>
         <w:t xml:space="preserve">Consultée, sans élément nouveau dans la fenêtre — HAS, « Les publications du secteur social, médico-social » (</w:t>
       </w:r>
       <w:hyperlink w:history="1" r:id="rIdz3_kjv9hczbsyvbp1dnfs">
@@ -581,7 +663,7 @@
           <w:sz w:val="22"/>
           <w:szCs w:val="22"/>
         </w:rPr>
-        <w:t xml:space="preserve">⛔ HAS, Appel à candidatures RBPP « Vie quotidienne des enfants 3-11 ans — PE » — page inaccessible (authentification requise lors de la consultation du 14/09/2026)</w:t>
+        <w:t xml:space="preserve">⛔ HAS, Appel à candidatures RBPP « Vie quotidienne des enfants 3-11 ans — PE » — page inaccessible (authentification requise lors de la consultation du 14/09/2026) ; calendrier repris de la note de cadrage publique, liée dans le corps</w:t>
       </w:r>
     </w:p>
     <w:p>
@@ -617,6 +699,113 @@
           <w:szCs w:val="18"/>
         </w:rPr>
         <w:t xml:space="preserve">Note méthodologique : WebSearch et WebFetch sont des outils de consultation, non des sources documentaires. Seules les pages HAS réellement ouvertes et fournissant un contenu utilisé dans la note sont comptées comme sources. Aucun fait d'actualité de mémoire : toutes les informations proviennent de sources récupérées le 14/09/2026.</w:t>
+      </w:r>
+    </w:p>
+    <w:p>
+      <w:r>
+        <w:t xml:space="preserve"/>
+      </w:r>
+    </w:p>
+    <w:p>
+      <w:pPr>
+        <w:spacing w:after="120" w:before="320"/>
+      </w:pPr>
+      <w:r>
+        <w:rPr>
+          <w:rFonts w:ascii="Calibri" w:cs="Calibri" w:eastAsia="Calibri" w:hAnsi="Calibri"/>
+          <w:b/>
+          <w:bCs/>
+          <w:color w:val="1B3A6B"/>
+          <w:sz w:val="28"/>
+          <w:szCs w:val="28"/>
+        </w:rPr>
+        <w:t xml:space="preserve">📝 Journal des corrections — 14 septembre 2026</w:t>
+      </w:r>
+    </w:p>
+    <w:p>
+      <w:pPr>
+        <w:spacing w:after="80"/>
+      </w:pPr>
+      <w:r>
+        <w:rPr>
+          <w:rFonts w:ascii="Calibri" w:cs="Calibri" w:eastAsia="Calibri" w:hAnsi="Calibri"/>
+          <w:b/>
+          <w:bCs/>
+          <w:color w:val="1F2937"/>
+          <w:sz w:val="22"/>
+          <w:szCs w:val="22"/>
+        </w:rPr>
+        <w:t xml:space="preserve">Note produite le 14/09/2026 à 8h40, relue le jour même. CINQ corrections, toutes dans « À venir » et « Sources » — l'actualité de la semaine (SSP 2026, CSMS du 29/09) était exacte.</w:t>
+      </w:r>
+    </w:p>
+    <w:p>
+      <w:pPr>
+        <w:spacing w:after="80"/>
+      </w:pPr>
+      <w:r>
+        <w:rPr>
+          <w:rFonts w:ascii="Calibri" w:cs="Calibri" w:eastAsia="Calibri" w:hAnsi="Calibri"/>
+          <w:color w:val="1F2937"/>
+          <w:sz w:val="22"/>
+          <w:szCs w:val="22"/>
+        </w:rPr>
+        <w:t xml:space="preserve">① Un titre entre guillemets qui n'était pas celui de la page. « 6e cycle de certification : premiers résultats et perspectives vers 2030 » : le calendrier HAS écrit « premiers résultats et cap sur 2030 ». La passe B-FR du contrôle commun (㉖, 14/09/2026) rend exit 1 sur la note d'origine : « ABSENTE DE LA SOURCE NOMMEE ».</w:t>
+      </w:r>
+    </w:p>
+    <w:p>
+      <w:pPr>
+        <w:spacing w:after="80"/>
+      </w:pPr>
+      <w:r>
+        <w:rPr>
+          <w:rFonts w:ascii="Calibri" w:cs="Calibri" w:eastAsia="Calibri" w:hAnsi="Calibri"/>
+          <w:color w:val="1F2937"/>
+          <w:sz w:val="22"/>
+          <w:szCs w:val="22"/>
+        </w:rPr>
+        <w:t xml:space="preserve">② Habitat volet 3. « Appel à candidatures en cours, statut non confirmé au 14/09/2026 » : l'édition du 02/09 de cette même veille écrivait « clôture 03/04/2026 », page alors ouverte. Une édition ne peut pas savoir moins que la précédente.</w:t>
+      </w:r>
+    </w:p>
+    <w:p>
+      <w:pPr>
+        <w:spacing w:after="80"/>
+      </w:pPr>
+      <w:r>
+        <w:rPr>
+          <w:rFonts w:ascii="Calibri" w:cs="Calibri" w:eastAsia="Calibri" w:hAnsi="Calibri"/>
+          <w:color w:val="1F2937"/>
+          <w:sz w:val="22"/>
+          <w:szCs w:val="22"/>
+        </w:rPr>
+        <w:t xml:space="preserve">③ Vie quotidienne 3-11 ans. « Publication estimée : 2027 (délai habituel 18-24 mois après constitution du groupe) » était un délai de mémoire écrit sous une page inaccessible, alors que la note de cadrage (validée le 7 juillet 2026, publique) donne le calendrier : groupes 09-10/2026, travaux 11/2026-10/2027, relecture 07-09/2027, passage en commission 4e trimestre 2027. La note de cadrage est liée ; « clôturé début septembre » est daté au 4 septembre d'après l'édition du 02/09.</w:t>
+      </w:r>
+    </w:p>
+    <w:p>
+      <w:pPr>
+        <w:spacing w:after="80"/>
+      </w:pPr>
+      <w:r>
+        <w:rPr>
+          <w:rFonts w:ascii="Calibri" w:cs="Calibri" w:eastAsia="Calibri" w:hAnsi="Calibri"/>
+          <w:color w:val="1F2937"/>
+          <w:sz w:val="22"/>
+          <w:szCs w:val="22"/>
+        </w:rPr>
+        <w:t xml:space="preserve">④ La consultation d'usagers sur les actes esthétiques était exacte (8 → 30 septembre) mais ne venait d'aucune des cinq sources listées : la page de l'appel (p_4391619) est liée dans le corps et ajoutée aux sources ✅ ; en-tête d'origine « 2 ✅ | 1 consultée | 2 ⛔ — 5 tentées », révisé en 3 ✅ — 6.</w:t>
+      </w:r>
+    </w:p>
+    <w:p>
+      <w:pPr>
+        <w:spacing w:after="80"/>
+      </w:pPr>
+      <w:r>
+        <w:rPr>
+          <w:rFonts w:ascii="Calibri" w:cs="Calibri" w:eastAsia="Calibri" w:hAnsi="Calibri"/>
+          <w:color w:val="1F2937"/>
+          <w:sz w:val="22"/>
+          <w:szCs w:val="22"/>
+        </w:rPr>
+        <w:t xml:space="preserve">⑤ L'article SSP était lié par une adresse au slug de 2025 (« …-2025-la-has-aussi-engagee-dans-la-securite-des-soins-pediatriques ») — identifiant réutilisé par la HAS, page 2026 servie, mais un lien qui annonce l'an dernier. Remplacée par l'adresse canonique de la page.</w:t>
       </w:r>
     </w:p>
     <w:sectPr>

</xml_diff>

<commit_message>
fix(rbpp-pipeline): corrige la veille HAS du 14/09 — « Horizon 2027 probable » remplacé par le calendrier de la note de cadrage, flux RSS lié comme source de la semaine creuse (4 ✅ | 1 | 2 ⛔ — 7) ; journal du 21/09
Co-Authored-By: Claude Opus 5 <noreply@anthropic.com>
</commit_message>
<xml_diff>
--- a/sources/veille/2026-09-14_veille_has-actualite.docx
+++ b/sources/veille/2026-09-14_veille_has-actualite.docx
@@ -112,7 +112,39 @@
           <w:sz w:val="22"/>
           <w:szCs w:val="22"/>
         </w:rPr>
-        <w:t xml:space="preserve">Pas de nouvelle RBPP publiée cette semaine dans le secteur social et médico-social. Deux RBPP sont en cours d'élaboration (voir § À venir).</w:t>
+        <w:t xml:space="preserve">Pas de nouvelle RBPP publiée cette semaine dans le secteur social et médico-social — confirmé à la relecture du 21/09/2026 sur le flux RSS « Recommandations et guides » de la HAS (</w:t>
+      </w:r>
+      <w:hyperlink w:history="1" r:id="rIdC14rss">
+        <w:r>
+          <w:rPr>
+            <w:rFonts w:ascii="Calibri" w:cs="Calibri" w:eastAsia="Calibri" w:hAnsi="Calibri"/>
+            <w:color w:val="1155CC"/>
+            <w:sz w:val="22"/>
+            <w:szCs w:val="22"/>
+            <w:u w:val="single"/>
+          </w:rPr>
+          <w:t xml:space="preserve">has-sante.fr/feed/Rss2.jsp?id=p_3081452</w:t>
+        </w:r>
+      </w:hyperlink>
+      <w:r>
+        <w:rPr>
+          <w:rFonts w:ascii="Calibri" w:cs="Calibri" w:eastAsia="Calibri" w:hAnsi="Calibri"/>
+          <w:color w:val="1F2937"/>
+          <w:sz w:val="22"/>
+          <w:szCs w:val="22"/>
+        </w:rPr>
+        <w:t xml:space="preserve">) : aucune entrée du secteur datée du 7 au 14 septembre. Deux RBPP sont en cours d'élaboration (voir § À venir). </w:t>
+      </w:r>
+      <w:r>
+        <w:rPr>
+          <w:rFonts w:ascii="Calibri" w:cs="Calibri" w:eastAsia="Calibri" w:hAnsi="Calibri"/>
+          <w:i/>
+          <w:iCs/>
+          <w:color w:val="6B7280"/>
+          <w:sz w:val="20"/>
+          <w:szCs w:val="20"/>
+        </w:rPr>
+        <w:t xml:space="preserve">[Corrigé le 21/09/2026 : le constat venait d'une page de liste qui rend son contenu en JavaScript ; le flux, lisible en headless, le confirme.]</w:t>
       </w:r>
     </w:p>
     <w:p>
@@ -444,7 +476,18 @@
           <w:sz w:val="22"/>
           <w:szCs w:val="22"/>
         </w:rPr>
-        <w:t xml:space="preserve">RBPP en élaboration — Horizon 2027 probable. Pas d'impact opérationnel à court terme, mais les établissements accueillant des enfants (protection de l'enfance) peuvent suivre l'avancement du groupe de travail.</w:t>
+        <w:t xml:space="preserve">RBPP en élaboration — passage en commission prévu au 4e trimestre 2027 pour la RBPP vie quotidienne 3-11 ans, selon sa note de cadrage (liée au § À venir) ; aucune date connue pour l'habitat volet 3. Pas d'impact opérationnel à court terme, mais les établissements accueillant des enfants (protection de l'enfance) peuvent suivre l'avancement du groupe de travail. </w:t>
+      </w:r>
+      <w:r>
+        <w:rPr>
+          <w:rFonts w:ascii="Calibri" w:cs="Calibri" w:eastAsia="Calibri" w:hAnsi="Calibri"/>
+          <w:i/>
+          <w:iCs/>
+          <w:color w:val="6B7280"/>
+          <w:sz w:val="20"/>
+          <w:szCs w:val="20"/>
+        </w:rPr>
+        <w:t xml:space="preserve">[Corrigé le 21/09/2026 : « Horizon 2027 probable » était une projection sans page, restée après la correction du 14/09 qui avait pourtant ramené le calendrier de la note de cadrage au § À venir.]</w:t>
       </w:r>
     </w:p>
     <w:p>
@@ -484,7 +527,7 @@
           <w:sz w:val="20"/>
           <w:szCs w:val="20"/>
         </w:rPr>
-        <w:t xml:space="preserve">3 ✅ effectivement reprises dans le corps | 1 consultée sans élément nouveau | 2 ⛔ inaccessibles — 6 sources documentaires tentées (décompte révisé le 14/09/2026)</w:t>
+        <w:t xml:space="preserve">4 ✅ effectivement reprises dans le corps | 1 consultée sans élément nouveau | 2 ⛔ inaccessibles — 7 sources documentaires tentées (décompte révisé le 14/09/2026, puis le 21/09/2026)</w:t>
       </w:r>
     </w:p>
     <w:p>
@@ -623,6 +666,46 @@
           <w:sz w:val="22"/>
           <w:szCs w:val="22"/>
         </w:rPr>
+        <w:t xml:space="preserve">✅ HAS, flux RSS « Recommandations et guides » — lu le 21 septembre 2026 à la relecture (</w:t>
+      </w:r>
+      <w:hyperlink w:history="1" r:id="rIdC14rss">
+        <w:r>
+          <w:rPr>
+            <w:rFonts w:ascii="Calibri" w:cs="Calibri" w:eastAsia="Calibri" w:hAnsi="Calibri"/>
+            <w:color w:val="1155CC"/>
+            <w:sz w:val="22"/>
+            <w:szCs w:val="22"/>
+            <w:u w:val="single"/>
+          </w:rPr>
+          <w:t xml:space="preserve">has-sante.fr/feed/Rss2.jsp?id=p_3081452</w:t>
+        </w:r>
+      </w:hyperlink>
+      <w:r>
+        <w:rPr>
+          <w:rFonts w:ascii="Calibri" w:cs="Calibri" w:eastAsia="Calibri" w:hAnsi="Calibri"/>
+          <w:color w:val="1F2937"/>
+          <w:sz w:val="22"/>
+          <w:szCs w:val="22"/>
+        </w:rPr>
+        <w:t xml:space="preserve">) — HTTP 200 vérifié</w:t>
+      </w:r>
+    </w:p>
+    <w:p>
+      <w:pPr>
+        <w:pStyle w:val="ListParagraph"/>
+        <w:numPr>
+          <w:ilvl w:val="0"/>
+          <w:numId w:val="1"/>
+        </w:numPr>
+        <w:spacing w:after="60"/>
+      </w:pPr>
+      <w:r>
+        <w:rPr>
+          <w:rFonts w:ascii="Calibri" w:cs="Calibri" w:eastAsia="Calibri" w:hAnsi="Calibri"/>
+          <w:color w:val="1F2937"/>
+          <w:sz w:val="22"/>
+          <w:szCs w:val="22"/>
+        </w:rPr>
         <w:t xml:space="preserve">Consultée, sans élément nouveau dans la fenêtre — HAS, « Les publications du secteur social, médico-social » (</w:t>
       </w:r>
       <w:hyperlink w:history="1" r:id="rIdz3_kjv9hczbsyvbp1dnfs">
@@ -806,6 +889,101 @@
           <w:szCs w:val="22"/>
         </w:rPr>
         <w:t xml:space="preserve">⑤ L'article SSP était lié par une adresse au slug de 2025 (« …-2025-la-has-aussi-engagee-dans-la-securite-des-soins-pediatriques ») — identifiant réutilisé par la HAS, page 2026 servie, mais un lien qui annonce l'an dernier. Remplacée par l'adresse canonique de la page.</w:t>
+      </w:r>
+    </w:p>
+    <w:p>
+      <w:pPr>
+        <w:spacing w:after="120" w:before="320"/>
+      </w:pPr>
+      <w:r>
+        <w:rPr>
+          <w:rFonts w:ascii="Calibri" w:cs="Calibri" w:eastAsia="Calibri" w:hAnsi="Calibri"/>
+          <w:b/>
+          <w:bCs/>
+          <w:color w:val="1B3A6B"/>
+          <w:sz w:val="28"/>
+          <w:szCs w:val="28"/>
+        </w:rPr>
+        <w:t xml:space="preserve">📝 Journal des corrections — 21 septembre 2026</w:t>
+      </w:r>
+    </w:p>
+    <w:p>
+      <w:pPr>
+        <w:spacing w:after="60"/>
+      </w:pPr>
+      <w:r>
+        <w:rPr>
+          <w:rFonts w:ascii="Calibri" w:cs="Calibri" w:eastAsia="Calibri" w:hAnsi="Calibri"/>
+          <w:i/>
+          <w:iCs/>
+          <w:color w:val="6B7280"/>
+          <w:sz w:val="20"/>
+          <w:szCs w:val="20"/>
+        </w:rPr>
+        <w:t xml:space="preserve">Relecture du 21/09/2026, au passage du contrôle de note ajouté ce jour au prompt (étape 7.6 bis). Deux corrections, marquées [Corrigé le 21/09/2026 : …]. Formulations d'origine :</w:t>
+      </w:r>
+    </w:p>
+    <w:p>
+      <w:pPr>
+        <w:pStyle w:val="ListParagraph"/>
+        <w:numPr>
+          <w:ilvl w:val="0"/>
+          <w:numId w:val="1"/>
+        </w:numPr>
+        <w:spacing w:after="60"/>
+      </w:pPr>
+      <w:r>
+        <w:rPr>
+          <w:rFonts w:ascii="Calibri" w:cs="Calibri" w:eastAsia="Calibri" w:hAnsi="Calibri"/>
+          <w:i/>
+          <w:iCs/>
+          <w:color w:val="6B7280"/>
+          <w:sz w:val="20"/>
+          <w:szCs w:val="20"/>
+        </w:rPr>
+        <w:t xml:space="preserve">En bref : « Pas de nouvelle RBPP publiée cette semaine » — constat sans source lisible ; confirmé sur le flux RSS de la HAS le 21/09/2026.</w:t>
+      </w:r>
+    </w:p>
+    <w:p>
+      <w:pPr>
+        <w:pStyle w:val="ListParagraph"/>
+        <w:numPr>
+          <w:ilvl w:val="0"/>
+          <w:numId w:val="1"/>
+        </w:numPr>
+        <w:spacing w:after="60"/>
+      </w:pPr>
+      <w:r>
+        <w:rPr>
+          <w:rFonts w:ascii="Calibri" w:cs="Calibri" w:eastAsia="Calibri" w:hAnsi="Calibri"/>
+          <w:i/>
+          <w:iCs/>
+          <w:color w:val="6B7280"/>
+          <w:sz w:val="20"/>
+          <w:szCs w:val="20"/>
+        </w:rPr>
+        <w:t xml:space="preserve">Impacts : « RBPP en élaboration — Horizon 2027 probable » — projection ; la note de cadrage écrit « Passage en commission : 4ème trimestre 2027 ».</w:t>
+      </w:r>
+    </w:p>
+    <w:p>
+      <w:pPr>
+        <w:pStyle w:val="ListParagraph"/>
+        <w:numPr>
+          <w:ilvl w:val="0"/>
+          <w:numId w:val="1"/>
+        </w:numPr>
+        <w:spacing w:after="60"/>
+      </w:pPr>
+      <w:r>
+        <w:rPr>
+          <w:rFonts w:ascii="Calibri" w:cs="Calibri" w:eastAsia="Calibri" w:hAnsi="Calibri"/>
+          <w:i/>
+          <w:iCs/>
+          <w:color w:val="6B7280"/>
+          <w:sz w:val="20"/>
+          <w:szCs w:val="20"/>
+        </w:rPr>
+        <w:t xml:space="preserve">Sources : « 3 ✅ | 1 | 2 ⛔ — 6 » — le flux RSS ajouté à la relecture : 4 ✅ | 1 | 2 ⛔ — 7.</w:t>
       </w:r>
     </w:p>
     <w:sectPr>

</xml_diff>